<commit_message>
week 2 complete :feat: implement async WeatherService layer and decouple API routing
- Created the app/services architecture to enforce clean code modularity.
- Implemented WeatherService utilizing high-performance httpx.AsyncClient.
- Configured secure environment variable parsing for external API keys.
- Refactored app/main.py to route asynchronous city queries to the new service.
- Locked and updated project dependencies in requirements.txt.
- Verified external error boundaries and 200 OK responses via local Swagger UI.
</commit_message>
<xml_diff>
--- a/WEATHER API WORD FILE.docx
+++ b/WEATHER API WORD FILE.docx
@@ -49,6 +49,7 @@
         <w:rPr>
           <w:noProof/>
         </w:rPr>
+        <w:lastRenderedPageBreak/>
         <w:drawing>
           <wp:inline distT="0" distB="0" distL="0" distR="0" wp14:anchorId="2E7F8628" wp14:editId="2FE3A066">
             <wp:extent cx="5731510" cy="3222625"/>
@@ -66,6 +67,289 @@
                   </pic:nvPicPr>
                   <pic:blipFill>
                     <a:blip r:embed="rId5"/>
+                    <a:stretch>
+                      <a:fillRect/>
+                    </a:stretch>
+                  </pic:blipFill>
+                  <pic:spPr>
+                    <a:xfrm>
+                      <a:off x="0" y="0"/>
+                      <a:ext cx="5731510" cy="3222625"/>
+                    </a:xfrm>
+                    <a:prstGeom prst="rect">
+                      <a:avLst/>
+                    </a:prstGeom>
+                  </pic:spPr>
+                </pic:pic>
+              </a:graphicData>
+            </a:graphic>
+          </wp:inline>
+        </w:drawing>
+      </w:r>
+      <w:r>
+        <w:rPr>
+          <w:noProof/>
+        </w:rPr>
+        <w:drawing>
+          <wp:inline distT="0" distB="0" distL="0" distR="0" wp14:anchorId="7ACC2C06" wp14:editId="2F0350CA">
+            <wp:extent cx="5731510" cy="3222625"/>
+            <wp:effectExtent l="0" t="0" r="2540" b="0"/>
+            <wp:docPr id="3" name="Picture 3"/>
+            <wp:cNvGraphicFramePr>
+              <a:graphicFrameLocks xmlns:a="http://schemas.openxmlformats.org/drawingml/2006/main" noChangeAspect="1"/>
+            </wp:cNvGraphicFramePr>
+            <a:graphic xmlns:a="http://schemas.openxmlformats.org/drawingml/2006/main">
+              <a:graphicData uri="http://schemas.openxmlformats.org/drawingml/2006/picture">
+                <pic:pic xmlns:pic="http://schemas.openxmlformats.org/drawingml/2006/picture">
+                  <pic:nvPicPr>
+                    <pic:cNvPr id="1" name=""/>
+                    <pic:cNvPicPr/>
+                  </pic:nvPicPr>
+                  <pic:blipFill>
+                    <a:blip r:embed="rId6"/>
+                    <a:stretch>
+                      <a:fillRect/>
+                    </a:stretch>
+                  </pic:blipFill>
+                  <pic:spPr>
+                    <a:xfrm>
+                      <a:off x="0" y="0"/>
+                      <a:ext cx="5731510" cy="3222625"/>
+                    </a:xfrm>
+                    <a:prstGeom prst="rect">
+                      <a:avLst/>
+                    </a:prstGeom>
+                  </pic:spPr>
+                </pic:pic>
+              </a:graphicData>
+            </a:graphic>
+          </wp:inline>
+        </w:drawing>
+      </w:r>
+      <w:r>
+        <w:rPr>
+          <w:noProof/>
+        </w:rPr>
+        <w:lastRenderedPageBreak/>
+        <w:drawing>
+          <wp:inline distT="0" distB="0" distL="0" distR="0" wp14:anchorId="49B711B9" wp14:editId="11F80864">
+            <wp:extent cx="5731510" cy="3222625"/>
+            <wp:effectExtent l="0" t="0" r="2540" b="0"/>
+            <wp:docPr id="4" name="Picture 4"/>
+            <wp:cNvGraphicFramePr>
+              <a:graphicFrameLocks xmlns:a="http://schemas.openxmlformats.org/drawingml/2006/main" noChangeAspect="1"/>
+            </wp:cNvGraphicFramePr>
+            <a:graphic xmlns:a="http://schemas.openxmlformats.org/drawingml/2006/main">
+              <a:graphicData uri="http://schemas.openxmlformats.org/drawingml/2006/picture">
+                <pic:pic xmlns:pic="http://schemas.openxmlformats.org/drawingml/2006/picture">
+                  <pic:nvPicPr>
+                    <pic:cNvPr id="1" name=""/>
+                    <pic:cNvPicPr/>
+                  </pic:nvPicPr>
+                  <pic:blipFill>
+                    <a:blip r:embed="rId7"/>
+                    <a:stretch>
+                      <a:fillRect/>
+                    </a:stretch>
+                  </pic:blipFill>
+                  <pic:spPr>
+                    <a:xfrm>
+                      <a:off x="0" y="0"/>
+                      <a:ext cx="5731510" cy="3222625"/>
+                    </a:xfrm>
+                    <a:prstGeom prst="rect">
+                      <a:avLst/>
+                    </a:prstGeom>
+                  </pic:spPr>
+                </pic:pic>
+              </a:graphicData>
+            </a:graphic>
+          </wp:inline>
+        </w:drawing>
+      </w:r>
+      <w:r>
+        <w:rPr>
+          <w:noProof/>
+        </w:rPr>
+        <w:drawing>
+          <wp:inline distT="0" distB="0" distL="0" distR="0" wp14:anchorId="4B170691" wp14:editId="2EA95599">
+            <wp:extent cx="5731510" cy="3222625"/>
+            <wp:effectExtent l="0" t="0" r="2540" b="0"/>
+            <wp:docPr id="5" name="Picture 5"/>
+            <wp:cNvGraphicFramePr>
+              <a:graphicFrameLocks xmlns:a="http://schemas.openxmlformats.org/drawingml/2006/main" noChangeAspect="1"/>
+            </wp:cNvGraphicFramePr>
+            <a:graphic xmlns:a="http://schemas.openxmlformats.org/drawingml/2006/main">
+              <a:graphicData uri="http://schemas.openxmlformats.org/drawingml/2006/picture">
+                <pic:pic xmlns:pic="http://schemas.openxmlformats.org/drawingml/2006/picture">
+                  <pic:nvPicPr>
+                    <pic:cNvPr id="1" name=""/>
+                    <pic:cNvPicPr/>
+                  </pic:nvPicPr>
+                  <pic:blipFill>
+                    <a:blip r:embed="rId8"/>
+                    <a:stretch>
+                      <a:fillRect/>
+                    </a:stretch>
+                  </pic:blipFill>
+                  <pic:spPr>
+                    <a:xfrm>
+                      <a:off x="0" y="0"/>
+                      <a:ext cx="5731510" cy="3222625"/>
+                    </a:xfrm>
+                    <a:prstGeom prst="rect">
+                      <a:avLst/>
+                    </a:prstGeom>
+                  </pic:spPr>
+                </pic:pic>
+              </a:graphicData>
+            </a:graphic>
+          </wp:inline>
+        </w:drawing>
+      </w:r>
+      <w:r>
+        <w:rPr>
+          <w:noProof/>
+        </w:rPr>
+        <w:lastRenderedPageBreak/>
+        <w:drawing>
+          <wp:inline distT="0" distB="0" distL="0" distR="0" wp14:anchorId="0FDD2D03" wp14:editId="73D4A37E">
+            <wp:extent cx="5731510" cy="3222625"/>
+            <wp:effectExtent l="0" t="0" r="2540" b="0"/>
+            <wp:docPr id="6" name="Picture 6"/>
+            <wp:cNvGraphicFramePr>
+              <a:graphicFrameLocks xmlns:a="http://schemas.openxmlformats.org/drawingml/2006/main" noChangeAspect="1"/>
+            </wp:cNvGraphicFramePr>
+            <a:graphic xmlns:a="http://schemas.openxmlformats.org/drawingml/2006/main">
+              <a:graphicData uri="http://schemas.openxmlformats.org/drawingml/2006/picture">
+                <pic:pic xmlns:pic="http://schemas.openxmlformats.org/drawingml/2006/picture">
+                  <pic:nvPicPr>
+                    <pic:cNvPr id="1" name=""/>
+                    <pic:cNvPicPr/>
+                  </pic:nvPicPr>
+                  <pic:blipFill>
+                    <a:blip r:embed="rId9"/>
+                    <a:stretch>
+                      <a:fillRect/>
+                    </a:stretch>
+                  </pic:blipFill>
+                  <pic:spPr>
+                    <a:xfrm>
+                      <a:off x="0" y="0"/>
+                      <a:ext cx="5731510" cy="3222625"/>
+                    </a:xfrm>
+                    <a:prstGeom prst="rect">
+                      <a:avLst/>
+                    </a:prstGeom>
+                  </pic:spPr>
+                </pic:pic>
+              </a:graphicData>
+            </a:graphic>
+          </wp:inline>
+        </w:drawing>
+      </w:r>
+      <w:r>
+        <w:rPr>
+          <w:noProof/>
+        </w:rPr>
+        <w:drawing>
+          <wp:inline distT="0" distB="0" distL="0" distR="0" wp14:anchorId="100C4847" wp14:editId="043E13C4">
+            <wp:extent cx="5731510" cy="3222625"/>
+            <wp:effectExtent l="0" t="0" r="2540" b="0"/>
+            <wp:docPr id="7" name="Picture 7"/>
+            <wp:cNvGraphicFramePr>
+              <a:graphicFrameLocks xmlns:a="http://schemas.openxmlformats.org/drawingml/2006/main" noChangeAspect="1"/>
+            </wp:cNvGraphicFramePr>
+            <a:graphic xmlns:a="http://schemas.openxmlformats.org/drawingml/2006/main">
+              <a:graphicData uri="http://schemas.openxmlformats.org/drawingml/2006/picture">
+                <pic:pic xmlns:pic="http://schemas.openxmlformats.org/drawingml/2006/picture">
+                  <pic:nvPicPr>
+                    <pic:cNvPr id="1" name=""/>
+                    <pic:cNvPicPr/>
+                  </pic:nvPicPr>
+                  <pic:blipFill>
+                    <a:blip r:embed="rId10"/>
+                    <a:stretch>
+                      <a:fillRect/>
+                    </a:stretch>
+                  </pic:blipFill>
+                  <pic:spPr>
+                    <a:xfrm>
+                      <a:off x="0" y="0"/>
+                      <a:ext cx="5731510" cy="3222625"/>
+                    </a:xfrm>
+                    <a:prstGeom prst="rect">
+                      <a:avLst/>
+                    </a:prstGeom>
+                  </pic:spPr>
+                </pic:pic>
+              </a:graphicData>
+            </a:graphic>
+          </wp:inline>
+        </w:drawing>
+      </w:r>
+      <w:r>
+        <w:rPr>
+          <w:noProof/>
+        </w:rPr>
+        <w:lastRenderedPageBreak/>
+        <w:drawing>
+          <wp:inline distT="0" distB="0" distL="0" distR="0" wp14:anchorId="313F04C1" wp14:editId="5A882039">
+            <wp:extent cx="5731510" cy="3222625"/>
+            <wp:effectExtent l="0" t="0" r="2540" b="0"/>
+            <wp:docPr id="8" name="Picture 8"/>
+            <wp:cNvGraphicFramePr>
+              <a:graphicFrameLocks xmlns:a="http://schemas.openxmlformats.org/drawingml/2006/main" noChangeAspect="1"/>
+            </wp:cNvGraphicFramePr>
+            <a:graphic xmlns:a="http://schemas.openxmlformats.org/drawingml/2006/main">
+              <a:graphicData uri="http://schemas.openxmlformats.org/drawingml/2006/picture">
+                <pic:pic xmlns:pic="http://schemas.openxmlformats.org/drawingml/2006/picture">
+                  <pic:nvPicPr>
+                    <pic:cNvPr id="1" name=""/>
+                    <pic:cNvPicPr/>
+                  </pic:nvPicPr>
+                  <pic:blipFill>
+                    <a:blip r:embed="rId11"/>
+                    <a:stretch>
+                      <a:fillRect/>
+                    </a:stretch>
+                  </pic:blipFill>
+                  <pic:spPr>
+                    <a:xfrm>
+                      <a:off x="0" y="0"/>
+                      <a:ext cx="5731510" cy="3222625"/>
+                    </a:xfrm>
+                    <a:prstGeom prst="rect">
+                      <a:avLst/>
+                    </a:prstGeom>
+                  </pic:spPr>
+                </pic:pic>
+              </a:graphicData>
+            </a:graphic>
+          </wp:inline>
+        </w:drawing>
+      </w:r>
+      <w:r>
+        <w:rPr>
+          <w:noProof/>
+        </w:rPr>
+        <w:drawing>
+          <wp:inline distT="0" distB="0" distL="0" distR="0" wp14:anchorId="119808B5" wp14:editId="4137498A">
+            <wp:extent cx="5731510" cy="3222625"/>
+            <wp:effectExtent l="0" t="0" r="2540" b="0"/>
+            <wp:docPr id="9" name="Picture 9"/>
+            <wp:cNvGraphicFramePr>
+              <a:graphicFrameLocks xmlns:a="http://schemas.openxmlformats.org/drawingml/2006/main" noChangeAspect="1"/>
+            </wp:cNvGraphicFramePr>
+            <a:graphic xmlns:a="http://schemas.openxmlformats.org/drawingml/2006/main">
+              <a:graphicData uri="http://schemas.openxmlformats.org/drawingml/2006/picture">
+                <pic:pic xmlns:pic="http://schemas.openxmlformats.org/drawingml/2006/picture">
+                  <pic:nvPicPr>
+                    <pic:cNvPr id="1" name=""/>
+                    <pic:cNvPicPr/>
+                  </pic:nvPicPr>
+                  <pic:blipFill>
+                    <a:blip r:embed="rId12"/>
                     <a:stretch>
                       <a:fillRect/>
                     </a:stretch>

</xml_diff>

<commit_message>
Week 3 completed : feat: define Pydantic schemas and internal v1 API endpoints
</commit_message>
<xml_diff>
--- a/WEATHER API WORD FILE.docx
+++ b/WEATHER API WORD FILE.docx
@@ -350,6 +350,128 @@
                   </pic:nvPicPr>
                   <pic:blipFill>
                     <a:blip r:embed="rId12"/>
+                    <a:stretch>
+                      <a:fillRect/>
+                    </a:stretch>
+                  </pic:blipFill>
+                  <pic:spPr>
+                    <a:xfrm>
+                      <a:off x="0" y="0"/>
+                      <a:ext cx="5731510" cy="3222625"/>
+                    </a:xfrm>
+                    <a:prstGeom prst="rect">
+                      <a:avLst/>
+                    </a:prstGeom>
+                  </pic:spPr>
+                </pic:pic>
+              </a:graphicData>
+            </a:graphic>
+          </wp:inline>
+        </w:drawing>
+      </w:r>
+      <w:r>
+        <w:rPr>
+          <w:noProof/>
+        </w:rPr>
+        <w:lastRenderedPageBreak/>
+        <w:drawing>
+          <wp:inline distT="0" distB="0" distL="0" distR="0" wp14:anchorId="421CA075" wp14:editId="73CC7A57">
+            <wp:extent cx="5731510" cy="3222625"/>
+            <wp:effectExtent l="0" t="0" r="2540" b="0"/>
+            <wp:docPr id="10" name="Picture 10"/>
+            <wp:cNvGraphicFramePr>
+              <a:graphicFrameLocks xmlns:a="http://schemas.openxmlformats.org/drawingml/2006/main" noChangeAspect="1"/>
+            </wp:cNvGraphicFramePr>
+            <a:graphic xmlns:a="http://schemas.openxmlformats.org/drawingml/2006/main">
+              <a:graphicData uri="http://schemas.openxmlformats.org/drawingml/2006/picture">
+                <pic:pic xmlns:pic="http://schemas.openxmlformats.org/drawingml/2006/picture">
+                  <pic:nvPicPr>
+                    <pic:cNvPr id="1" name=""/>
+                    <pic:cNvPicPr/>
+                  </pic:nvPicPr>
+                  <pic:blipFill>
+                    <a:blip r:embed="rId13"/>
+                    <a:stretch>
+                      <a:fillRect/>
+                    </a:stretch>
+                  </pic:blipFill>
+                  <pic:spPr>
+                    <a:xfrm>
+                      <a:off x="0" y="0"/>
+                      <a:ext cx="5731510" cy="3222625"/>
+                    </a:xfrm>
+                    <a:prstGeom prst="rect">
+                      <a:avLst/>
+                    </a:prstGeom>
+                  </pic:spPr>
+                </pic:pic>
+              </a:graphicData>
+            </a:graphic>
+          </wp:inline>
+        </w:drawing>
+      </w:r>
+      <w:r>
+        <w:rPr>
+          <w:noProof/>
+        </w:rPr>
+        <w:drawing>
+          <wp:inline distT="0" distB="0" distL="0" distR="0" wp14:anchorId="3D233570" wp14:editId="06C91DEC">
+            <wp:extent cx="5731510" cy="3222625"/>
+            <wp:effectExtent l="0" t="0" r="2540" b="0"/>
+            <wp:docPr id="11" name="Picture 11"/>
+            <wp:cNvGraphicFramePr>
+              <a:graphicFrameLocks xmlns:a="http://schemas.openxmlformats.org/drawingml/2006/main" noChangeAspect="1"/>
+            </wp:cNvGraphicFramePr>
+            <a:graphic xmlns:a="http://schemas.openxmlformats.org/drawingml/2006/main">
+              <a:graphicData uri="http://schemas.openxmlformats.org/drawingml/2006/picture">
+                <pic:pic xmlns:pic="http://schemas.openxmlformats.org/drawingml/2006/picture">
+                  <pic:nvPicPr>
+                    <pic:cNvPr id="1" name=""/>
+                    <pic:cNvPicPr/>
+                  </pic:nvPicPr>
+                  <pic:blipFill>
+                    <a:blip r:embed="rId14"/>
+                    <a:stretch>
+                      <a:fillRect/>
+                    </a:stretch>
+                  </pic:blipFill>
+                  <pic:spPr>
+                    <a:xfrm>
+                      <a:off x="0" y="0"/>
+                      <a:ext cx="5731510" cy="3222625"/>
+                    </a:xfrm>
+                    <a:prstGeom prst="rect">
+                      <a:avLst/>
+                    </a:prstGeom>
+                  </pic:spPr>
+                </pic:pic>
+              </a:graphicData>
+            </a:graphic>
+          </wp:inline>
+        </w:drawing>
+      </w:r>
+      <w:r>
+        <w:rPr>
+          <w:noProof/>
+        </w:rPr>
+        <w:lastRenderedPageBreak/>
+        <w:drawing>
+          <wp:inline distT="0" distB="0" distL="0" distR="0" wp14:anchorId="77DAB231" wp14:editId="331D6356">
+            <wp:extent cx="5731510" cy="3222625"/>
+            <wp:effectExtent l="0" t="0" r="2540" b="0"/>
+            <wp:docPr id="12" name="Picture 12"/>
+            <wp:cNvGraphicFramePr>
+              <a:graphicFrameLocks xmlns:a="http://schemas.openxmlformats.org/drawingml/2006/main" noChangeAspect="1"/>
+            </wp:cNvGraphicFramePr>
+            <a:graphic xmlns:a="http://schemas.openxmlformats.org/drawingml/2006/main">
+              <a:graphicData uri="http://schemas.openxmlformats.org/drawingml/2006/picture">
+                <pic:pic xmlns:pic="http://schemas.openxmlformats.org/drawingml/2006/picture">
+                  <pic:nvPicPr>
+                    <pic:cNvPr id="1" name=""/>
+                    <pic:cNvPicPr/>
+                  </pic:nvPicPr>
+                  <pic:blipFill>
+                    <a:blip r:embed="rId15"/>
                     <a:stretch>
                       <a:fillRect/>
                     </a:stretch>

</xml_diff>

<commit_message>
Week 4 complete and docs: add comprehensive project README covering weeks 1-4
- Documented system architecture, local setup instructions, and environmental security.
- Outlined Week 3 Pydantic schema designs and interactive OpenAPI validation logic.
- Added detailed breakdown of Week 4 API integration, data filtration loops, and 422 error resolutions.
- Formatted with markdown styling optimized for VS Code rendering.
</commit_message>
<xml_diff>
--- a/WEATHER API WORD FILE.docx
+++ b/WEATHER API WORD FILE.docx
@@ -472,6 +472,46 @@
                   </pic:nvPicPr>
                   <pic:blipFill>
                     <a:blip r:embed="rId15"/>
+                    <a:stretch>
+                      <a:fillRect/>
+                    </a:stretch>
+                  </pic:blipFill>
+                  <pic:spPr>
+                    <a:xfrm>
+                      <a:off x="0" y="0"/>
+                      <a:ext cx="5731510" cy="3222625"/>
+                    </a:xfrm>
+                    <a:prstGeom prst="rect">
+                      <a:avLst/>
+                    </a:prstGeom>
+                  </pic:spPr>
+                </pic:pic>
+              </a:graphicData>
+            </a:graphic>
+          </wp:inline>
+        </w:drawing>
+      </w:r>
+      <w:r>
+        <w:rPr>
+          <w:noProof/>
+        </w:rPr>
+        <w:drawing>
+          <wp:inline distT="0" distB="0" distL="0" distR="0" wp14:anchorId="6FACF37E" wp14:editId="734F676A">
+            <wp:extent cx="5731510" cy="3222625"/>
+            <wp:effectExtent l="0" t="0" r="2540" b="0"/>
+            <wp:docPr id="13" name="Picture 13"/>
+            <wp:cNvGraphicFramePr>
+              <a:graphicFrameLocks xmlns:a="http://schemas.openxmlformats.org/drawingml/2006/main" noChangeAspect="1"/>
+            </wp:cNvGraphicFramePr>
+            <a:graphic xmlns:a="http://schemas.openxmlformats.org/drawingml/2006/main">
+              <a:graphicData uri="http://schemas.openxmlformats.org/drawingml/2006/picture">
+                <pic:pic xmlns:pic="http://schemas.openxmlformats.org/drawingml/2006/picture">
+                  <pic:nvPicPr>
+                    <pic:cNvPr id="1" name=""/>
+                    <pic:cNvPicPr/>
+                  </pic:nvPicPr>
+                  <pic:blipFill>
+                    <a:blip r:embed="rId16"/>
                     <a:stretch>
                       <a:fillRect/>
                     </a:stretch>

</xml_diff>